<commit_message>
docs: Farmacovigilanza puo' anche confermare le CRF
Co-Authored-By: Claude Sonnet 5.5 <noreply@anthropic.com>
Claude-Session: https://claude.ai/code/session_01W5dnSnBCBBsCVaL4WkEJHL
</commit_message>
<xml_diff>
--- a/docs/superpowers/specs/2026-10-25-guida-allineamento-produzione-ticket-crf.docx
+++ b/docs/superpowers/specs/2026-10-25-guida-allineamento-produzione-ticket-crf.docx
@@ -289,7 +289,7 @@
               <w:pStyle w:val="Compact"/>
             </w:pPr>
             <w:r>
-              <w:t xml:space="preserve">Admins del centro (come staging)</w:t>
+              <w:t xml:space="preserve">Admins del centro e Farmacovigilanza (come staging). Gli altri gruppi non vedono il pulsante «Conferma CRF»</w:t>
             </w:r>
           </w:p>
         </w:tc>
@@ -1900,7 +1900,7 @@
               <w:pStyle w:val="Compact"/>
             </w:pPr>
             <w:r>
-              <w:t xml:space="preserve">Gruppi Admins del centro</w:t>
+              <w:t xml:space="preserve">Gruppi Admins del centro e Farmacovigilanza (solo chi lo ha vede il pulsante «Conferma CRF»)</w:t>
             </w:r>
           </w:p>
         </w:tc>

</xml_diff>